<commit_message>
acomodando web a logo nueva version mas nitida
</commit_message>
<xml_diff>
--- a/docs/brand/AROB-Manual-de-Marca.docx
+++ b/docs/brand/AROB-Manual-de-Marca.docx
@@ -4,13 +4,13 @@
   <w:body>
     <w:p>
       <w:pPr>
-        <w:spacing w:after="40" w:before="600"/>
+        <w:spacing w:after="40" w:before="620"/>
         <w:jc w:val="center"/>
       </w:pPr>
       <w:r>
         <w:drawing>
           <wp:inline distT="0" distB="0" distL="0" distR="0">
-            <wp:extent cx="2000250" cy="2571750"/>
+            <wp:extent cx="1809750" cy="1905000"/>
             <wp:effectExtent t="0" r="0" b="0" l="0"/>
             <wp:docPr id="1" name="" descr="" title=""/>
             <wp:cNvGraphicFramePr>
@@ -35,7 +35,7 @@
                   <pic:spPr bwMode="auto">
                     <a:xfrm>
                       <a:off x="0" y="0"/>
-                      <a:ext cx="2000250" cy="2571750"/>
+                      <a:ext cx="1809750" cy="1905000"/>
                     </a:xfrm>
                     <a:prstGeom prst="rect">
                       <a:avLst/>
@@ -50,6 +50,38 @@
     </w:p>
     <w:p>
       <w:pPr>
+        <w:spacing w:after="10"/>
+        <w:jc w:val="center"/>
+      </w:pPr>
+      <w:r>
+        <w:rPr>
+          <w:rFonts w:ascii="Arial" w:cs="Arial" w:eastAsia="Arial" w:hAnsi="Arial"/>
+          <w:b/>
+          <w:bCs/>
+          <w:color w:val="000033"/>
+          <w:sz w:val="56"/>
+          <w:szCs w:val="56"/>
+        </w:rPr>
+        <w:t xml:space="preserve">AROB</w:t>
+      </w:r>
+    </w:p>
+    <w:p>
+      <w:pPr>
+        <w:spacing w:after="20"/>
+        <w:jc w:val="center"/>
+      </w:pPr>
+      <w:r>
+        <w:rPr>
+          <w:color w:val="6B7280"/>
+          <w:spacing w:val="40"/>
+          <w:sz w:val="16"/>
+          <w:szCs w:val="16"/>
+        </w:rPr>
+        <w:t xml:space="preserve">SOFTWARE ENGINEERING</w:t>
+      </w:r>
+    </w:p>
+    <w:p>
+      <w:pPr>
         <w:spacing w:after="20" w:before="80"/>
         <w:jc w:val="center"/>
       </w:pPr>
@@ -148,7 +180,7 @@
           <w:i w:val="false"/>
           <w:iCs w:val="false"/>
         </w:rPr>
-        <w:t xml:space="preserve">El isotipo representa esa idea con una sola línea continua: una ola que se transforma en el símbolo “@”, sugiriendo movimiento, fluidez y una base sólida que se eleva hacia lo digital.</w:t>
+        <w:t xml:space="preserve">El isotipo combina el símbolo “@” con un monograma “aR” inscripto en su interior: un solo trazo circular que funde el signo de arroba con las iniciales de Ayelen Robredo.</w:t>
       </w:r>
     </w:p>
     <w:p>
@@ -166,7 +198,7 @@
         <w:spacing w:after="120" w:before="240"/>
       </w:pPr>
       <w:r>
-        <w:t xml:space="preserve">2.1 Versión principal</w:t>
+        <w:t xml:space="preserve">2.1 Isotipo — versión principal</w:t>
       </w:r>
     </w:p>
     <w:p>
@@ -180,7 +212,7 @@
           <w:i w:val="false"/>
           <w:iCs w:val="false"/>
         </w:rPr>
-        <w:t xml:space="preserve">Uso por defecto sobre fondos claros o blancos. Incluye isotipo, wordmark y tagline.</w:t>
+        <w:t xml:space="preserve">Uso por defecto sobre fondos claros o blancos. Es la versión de referencia; todas las demás se derivan de esta.</w:t>
       </w:r>
     </w:p>
     <w:p>
@@ -191,7 +223,7 @@
       <w:r>
         <w:drawing>
           <wp:inline distT="0" distB="0" distL="0" distR="0">
-            <wp:extent cx="1809750" cy="2324100"/>
+            <wp:extent cx="1619250" cy="1704975"/>
             <wp:effectExtent t="0" r="0" b="0" l="0"/>
             <wp:docPr id="1" name="" descr="" title=""/>
             <wp:cNvGraphicFramePr>
@@ -216,7 +248,7 @@
                   <pic:spPr bwMode="auto">
                     <a:xfrm>
                       <a:off x="0" y="0"/>
-                      <a:ext cx="1809750" cy="2324100"/>
+                      <a:ext cx="1619250" cy="1704975"/>
                     </a:xfrm>
                     <a:prstGeom prst="rect">
                       <a:avLst/>
@@ -235,7 +267,7 @@
         <w:spacing w:after="120" w:before="240"/>
       </w:pPr>
       <w:r>
-        <w:t xml:space="preserve">2.2 Isotipo</w:t>
+        <w:t xml:space="preserve">2.2 Versión monocromática</w:t>
       </w:r>
     </w:p>
     <w:p>
@@ -249,7 +281,7 @@
           <w:i w:val="false"/>
           <w:iCs w:val="false"/>
         </w:rPr>
-        <w:t xml:space="preserve">Versión reducida del isotipo, sin wordmark ni tagline. Se usa en espacios pequeños: favicon, íconos de redes sociales, marca de agua, navegación.</w:t>
+        <w:t xml:space="preserve">Para aplicaciones en un solo color (sellos, grabados, impresión en blanco y negro, documentos formales).</w:t>
       </w:r>
     </w:p>
     <w:p>
@@ -260,7 +292,7 @@
       <w:r>
         <w:drawing>
           <wp:inline distT="0" distB="0" distL="0" distR="0">
-            <wp:extent cx="1524000" cy="1524000"/>
+            <wp:extent cx="1428750" cy="1504950"/>
             <wp:effectExtent t="0" r="0" b="0" l="0"/>
             <wp:docPr id="1" name="" descr="" title=""/>
             <wp:cNvGraphicFramePr>
@@ -285,7 +317,7 @@
                   <pic:spPr bwMode="auto">
                     <a:xfrm>
                       <a:off x="0" y="0"/>
-                      <a:ext cx="1524000" cy="1524000"/>
+                      <a:ext cx="1428750" cy="1504950"/>
                     </a:xfrm>
                     <a:prstGeom prst="rect">
                       <a:avLst/>
@@ -304,7 +336,7 @@
         <w:spacing w:after="120" w:before="240"/>
       </w:pPr>
       <w:r>
-        <w:t xml:space="preserve">2.3 Versión monocromática</w:t>
+        <w:t xml:space="preserve">2.3 Versión negativa</w:t>
       </w:r>
     </w:p>
     <w:p>
@@ -318,7 +350,7 @@
           <w:i w:val="false"/>
           <w:iCs w:val="false"/>
         </w:rPr>
-        <w:t xml:space="preserve">Para aplicaciones en un solo color (sellos, grabados, impresión en blanco y negro, documentos formales).</w:t>
+        <w:t xml:space="preserve">Para uso sobre fondos oscuros o de color: fotografías, videos, presentaciones con fondo navy.</w:t>
       </w:r>
     </w:p>
     <w:p>
@@ -329,7 +361,7 @@
       <w:r>
         <w:drawing>
           <wp:inline distT="0" distB="0" distL="0" distR="0">
-            <wp:extent cx="1619250" cy="2085975"/>
+            <wp:extent cx="1428750" cy="1504950"/>
             <wp:effectExtent t="0" r="0" b="0" l="0"/>
             <wp:docPr id="1" name="" descr="" title=""/>
             <wp:cNvGraphicFramePr>
@@ -354,7 +386,7 @@
                   <pic:spPr bwMode="auto">
                     <a:xfrm>
                       <a:off x="0" y="0"/>
-                      <a:ext cx="1619250" cy="2085975"/>
+                      <a:ext cx="1428750" cy="1504950"/>
                     </a:xfrm>
                     <a:prstGeom prst="rect">
                       <a:avLst/>
@@ -373,7 +405,7 @@
         <w:spacing w:after="120" w:before="240"/>
       </w:pPr>
       <w:r>
-        <w:t xml:space="preserve">2.4 Versión negativa</w:t>
+        <w:t xml:space="preserve">2.4 Ícono de aplicación / favicon</w:t>
       </w:r>
     </w:p>
     <w:p>
@@ -387,7 +419,7 @@
           <w:i w:val="false"/>
           <w:iCs w:val="false"/>
         </w:rPr>
-        <w:t xml:space="preserve">Para uso sobre fondos oscuros o de color: fotografías, videos, presentaciones con fondo navy.</w:t>
+        <w:t xml:space="preserve">Formato para favicon del sitio, ícono de app o avatar de redes sociales: isotipo en blanco sobre el degradado de marca, dentro de un cuadrado con esquinas redondeadas.</w:t>
       </w:r>
     </w:p>
     <w:p>
@@ -398,7 +430,7 @@
       <w:r>
         <w:drawing>
           <wp:inline distT="0" distB="0" distL="0" distR="0">
-            <wp:extent cx="1619250" cy="2085975"/>
+            <wp:extent cx="1333500" cy="1333500"/>
             <wp:effectExtent t="0" r="0" b="0" l="0"/>
             <wp:docPr id="1" name="" descr="" title=""/>
             <wp:cNvGraphicFramePr>
@@ -423,75 +455,6 @@
                   <pic:spPr bwMode="auto">
                     <a:xfrm>
                       <a:off x="0" y="0"/>
-                      <a:ext cx="1619250" cy="2085975"/>
-                    </a:xfrm>
-                    <a:prstGeom prst="rect">
-                      <a:avLst/>
-                    </a:prstGeom>
-                  </pic:spPr>
-                </pic:pic>
-              </a:graphicData>
-            </a:graphic>
-          </wp:inline>
-        </w:drawing>
-      </w:r>
-    </w:p>
-    <w:p>
-      <w:pPr>
-        <w:pStyle w:val="Heading2"/>
-        <w:spacing w:after="120" w:before="240"/>
-      </w:pPr>
-      <w:r>
-        <w:t xml:space="preserve">2.5 Ícono de aplicación / favicon</w:t>
-      </w:r>
-    </w:p>
-    <w:p>
-      <w:pPr>
-        <w:spacing w:after="160"/>
-      </w:pPr>
-      <w:r>
-        <w:rPr>
-          <w:b w:val="false"/>
-          <w:bCs w:val="false"/>
-          <w:i w:val="false"/>
-          <w:iCs w:val="false"/>
-        </w:rPr>
-        <w:t xml:space="preserve">Formato para favicon del sitio, ícono de app o avatar de redes sociales: isotipo en blanco sobre el degradado de marca, dentro de un cuadrado con esquinas redondeadas.</w:t>
-      </w:r>
-    </w:p>
-    <w:p>
-      <w:pPr>
-        <w:spacing w:after="200" w:before="120"/>
-        <w:jc w:val="center"/>
-      </w:pPr>
-      <w:r>
-        <w:drawing>
-          <wp:inline distT="0" distB="0" distL="0" distR="0">
-            <wp:extent cx="1333500" cy="1333500"/>
-            <wp:effectExtent t="0" r="0" b="0" l="0"/>
-            <wp:docPr id="1" name="" descr="" title=""/>
-            <wp:cNvGraphicFramePr>
-              <a:graphicFrameLocks xmlns:a="http://schemas.openxmlformats.org/drawingml/2006/main" noChangeAspect="1"/>
-            </wp:cNvGraphicFramePr>
-            <a:graphic xmlns:a="http://schemas.openxmlformats.org/drawingml/2006/main">
-              <a:graphicData uri="http://schemas.openxmlformats.org/drawingml/2006/picture">
-                <pic:pic xmlns:pic="http://schemas.openxmlformats.org/drawingml/2006/picture">
-                  <pic:nvPicPr>
-                    <pic:cNvPr id="0" name="" descr=""/>
-                    <pic:cNvPicPr>
-                      <a:picLocks noChangeAspect="1" noChangeArrowheads="1"/>
-                    </pic:cNvPicPr>
-                  </pic:nvPicPr>
-                  <pic:blipFill>
-                    <a:blip r:embed="rId11" cstate="none"/>
-                    <a:srcRect/>
-                    <a:stretch>
-                      <a:fillRect/>
-                    </a:stretch>
-                  </pic:blipFill>
-                  <pic:spPr bwMode="auto">
-                    <a:xfrm>
-                      <a:off x="0" y="0"/>
                       <a:ext cx="1333500" cy="1333500"/>
                     </a:xfrm>
                     <a:prstGeom prst="rect">
@@ -511,7 +474,7 @@
         <w:spacing w:after="120" w:before="240"/>
       </w:pPr>
       <w:r>
-        <w:t xml:space="preserve">2.6 Área de protección y tamaño mínimo</w:t>
+        <w:t xml:space="preserve">2.5 Wordmark</w:t>
       </w:r>
     </w:p>
     <w:p>
@@ -525,7 +488,16 @@
           <w:i w:val="false"/>
           <w:iCs w:val="false"/>
         </w:rPr>
-        <w:t xml:space="preserve">Dejar alrededor del logotipo un margen libre equivalente, como mínimo, a la altura de la letra “A” del wordmark. Ningún otro elemento (texto, imágenes, bordes) debe invadir ese margen.</w:t>
+        <w:t xml:space="preserve">El isotipo no incluye el texto “AROB” dibujado: el nombre se compone siempre como texto vivo (no imagen), en Arvo Bold, acompañando al isotipo — nunca reemplazándolo ni redibujado a mano. El tagline “SOFTWARE ENGINEERING” va en Montserrat, versalitas, con tracking amplio. Ver sección 4 (Tipografía) para el detalle.</w:t>
+      </w:r>
+    </w:p>
+    <w:p>
+      <w:pPr>
+        <w:pStyle w:val="Heading2"/>
+        <w:spacing w:after="120" w:before="240"/>
+      </w:pPr>
+      <w:r>
+        <w:t xml:space="preserve">2.6 Área de protección y tamaño mínimo</w:t>
       </w:r>
     </w:p>
     <w:p>
@@ -539,7 +511,21 @@
           <w:i w:val="false"/>
           <w:iCs w:val="false"/>
         </w:rPr>
-        <w:t xml:space="preserve">Tamaño mínimo recomendado: 28px de alto para el isotipo solo, 90px de alto para la versión principal completa. Por debajo de esos tamaños el trazo del isotipo pierde legibilidad.</w:t>
+        <w:t xml:space="preserve">Dejar alrededor del isotipo un margen libre equivalente, como mínimo, a un cuarto de su ancho total. Ningún otro elemento (texto, imágenes, bordes) debe invadir ese margen.</w:t>
+      </w:r>
+    </w:p>
+    <w:p>
+      <w:pPr>
+        <w:spacing w:after="160"/>
+      </w:pPr>
+      <w:r>
+        <w:rPr>
+          <w:b w:val="false"/>
+          <w:bCs w:val="false"/>
+          <w:i w:val="false"/>
+          <w:iCs w:val="false"/>
+        </w:rPr>
+        <w:t xml:space="preserve">Tamaño mínimo recomendado: 24px de alto para el isotipo solo. Por debajo de ese tamaño el trazo del monograma interior pierde legibilidad.</w:t>
       </w:r>
     </w:p>
     <w:p>
@@ -561,7 +547,7 @@
         <w:spacing w:after="80"/>
       </w:pPr>
       <w:r>
-        <w:t xml:space="preserve">No estirar ni deformar el logotipo en ningún eje.</w:t>
+        <w:t xml:space="preserve">No estirar ni deformar el isotipo en ningún eje.</w:t>
       </w:r>
     </w:p>
     <w:p>
@@ -574,7 +560,7 @@
         <w:spacing w:after="80"/>
       </w:pPr>
       <w:r>
-        <w:t xml:space="preserve">No rotar el isotipo ni el wordmark.</w:t>
+        <w:t xml:space="preserve">No rotar el isotipo.</w:t>
       </w:r>
     </w:p>
     <w:p>
@@ -613,7 +599,7 @@
         <w:spacing w:after="80"/>
       </w:pPr>
       <w:r>
-        <w:t xml:space="preserve">No recomponer el isotipo con otra tipografía para el wordmark.</w:t>
+        <w:t xml:space="preserve">No redibujar ni recomponer el monograma interior.</w:t>
       </w:r>
     </w:p>
     <w:p>
@@ -626,7 +612,7 @@
         <w:spacing w:after="80"/>
       </w:pPr>
       <w:r>
-        <w:t xml:space="preserve">No ubicar el logotipo sobre fondos con poco contraste.</w:t>
+        <w:t xml:space="preserve">No ubicar el isotipo sobre fondos con poco contraste.</w:t>
       </w:r>
     </w:p>
     <w:p>

</xml_diff>

<commit_message>
actualizando por nuevos ajustes en manual de marca
</commit_message>
<xml_diff>
--- a/docs/brand/AROB-Manual-de-Marca.docx
+++ b/docs/brand/AROB-Manual-de-Marca.docx
@@ -77,7 +77,7 @@
           <w:sz w:val="16"/>
           <w:szCs w:val="16"/>
         </w:rPr>
-        <w:t xml:space="preserve">SOFTWARE ENGINEERING</w:t>
+        <w:t>SOLUCIONES A MEDIDA</w:t>
       </w:r>
     </w:p>
     <w:p>
@@ -107,7 +107,7 @@
           <w:sz w:val="22"/>
           <w:szCs w:val="22"/>
         </w:rPr>
-        <w:t xml:space="preserve">Versión 1.0 · Julio 2026</w:t>
+        <w:t>Versión 1.1 · Agosto 2026</w:t>
       </w:r>
     </w:p>
     <w:p>
@@ -124,7 +124,7 @@
           <w:sz w:val="20"/>
           <w:szCs w:val="20"/>
         </w:rPr>
-        <w:t xml:space="preserve">Ayelen Robredo · AROB Software Engineering</w:t>
+        <w:t>Ayelen Robredo · AROB Soluciones a Medida</w:t>
       </w:r>
     </w:p>
     <w:p>
@@ -181,6 +181,11 @@
           <w:iCs w:val="false"/>
         </w:rPr>
         <w:t xml:space="preserve">El isotipo combina el símbolo “@” con un monograma “aR” inscripto en su interior: un solo trazo circular que funde el signo de arroba con las iniciales de Ayelen Robredo.</w:t>
+      </w:r>
+    </w:p>
+    <w:p>
+      <w:r>
+        <w:t>El nombre de marca convive con “arob.code”: el handle usado en Instagram y la URL del sitio (arobcode.vercel.app), la misma marca en formato legible como usuario/dominio (“arob” a secas ya estaba tomado). En piezas de marca, “arob.code” acompaña al wordmark “AROB” como referencia más chica — nunca lo reemplaza.</w:t>
       </w:r>
     </w:p>
     <w:p>
@@ -488,7 +493,7 @@
           <w:i w:val="false"/>
           <w:iCs w:val="false"/>
         </w:rPr>
-        <w:t xml:space="preserve">El isotipo no incluye el texto “AROB” dibujado: el nombre se compone siempre como texto vivo (no imagen), en Arvo Bold, acompañando al isotipo — nunca reemplazándolo ni redibujado a mano. El tagline “SOFTWARE ENGINEERING” va en Montserrat, versalitas, con tracking amplio. Ver sección 4 (Tipografía) para el detalle.</w:t>
+        <w:t>El isotipo no incluye el texto “AROB” dibujado: el nombre se compone siempre como texto vivo (no imagen), en Arvo Bold, acompañando al isotipo — nunca reemplazándolo ni redibujado a mano. El tagline “SOLUCIONES A MEDIDA” va en Montserrat, versalitas, con tracking amplio, junto al wordmark. “arob.code” (el handle de Instagram y la URL del sitio) puede acompañar como referencia más chica — complementa al wordmark, no lo reemplaza. Ver sección 4 (Tipografía) y sección 7 (SEO vs. tagline) para el detalle.</w:t>
       </w:r>
     </w:p>
     <w:p>
@@ -1078,7 +1083,7 @@
           <w:i w:val="false"/>
           <w:iCs w:val="false"/>
         </w:rPr>
-        <w:t xml:space="preserve">Tipografía de uso general: párrafos, menú de navegación, botones, formularios y el tagline “SOFTWARE ENGINEERING” (en versalitas, con tracking amplio).</w:t>
+        <w:t>Tipografía de uso general: párrafos, menú de navegación, botones, formularios y el tagline “SOLUCIONES A MEDIDA” (en versalitas, con tracking amplio).</w:t>
       </w:r>
     </w:p>
     <w:p>
@@ -1167,7 +1172,7 @@
         <w:spacing w:after="80"/>
       </w:pPr>
       <w:r>
-        <w:t xml:space="preserve">Footer: isotipo pequeño junto al texto de copyright.</w:t>
+        <w:t>Footer: isotipo pequeño + wordmark “AROB” · tagline “Soluciones a Medida” · referencia “arob.code”, junto al texto de copyright.</w:t>
       </w:r>
     </w:p>
     <w:p>
@@ -1211,6 +1216,24 @@
       <w:pPr>
         <w:spacing w:before="400"/>
       </w:pPr>
+    </w:p>
+    <w:p>
+      <w:pPr>
+        <w:pStyle w:val="Heading1"/>
+      </w:pPr>
+      <w:r>
+        <w:t>7. SEO vs. tagline</w:t>
+      </w:r>
+    </w:p>
+    <w:p>
+      <w:r>
+        <w:t>El tagline “Soluciones a Medida” es una frase de identidad de marca, no la herramienta de SEO: es corto a propósito, porque AROB ofrece más de un servicio (desarrollo web, apps, análisis, automatizaciones) y el tagline no tiene que listarlos.</w:t>
+      </w:r>
+    </w:p>
+    <w:p>
+      <w:r>
+        <w:t>El SEO y la claridad de servicios se resuelven en otra capa: el H1 de la landing y el meta title/description deben ser descriptivos, con keywords reales que el público busca en Google (ej. “Desarrollo web y apps para emprendedores y PyMEs”), nunca el tagline. La sección de servicios en el cuerpo de la landing es donde se listan los servicios concretos.</w:t>
+      </w:r>
     </w:p>
     <w:p>
       <w:pPr>

</xml_diff>